<commit_message>
Korrektur: biotec hat drei Standorte, nicht zwei
Der in der Mitschrift als "Walda Technologiepark" notierte Ort ist ein eigener
dritter Standort: Technologiepark Mittweida, Analytik von Boden und Wasser,
2-3 Personen. Muenchen ebenfalls praezisiert auf 2-3 Personen.

- Kundenfassung und interne Langfassung des Protokolls neu generiert
- Standorttabelle in projektstatus.md und beteiligte-und-rollen.md
- Offene Frage 33 beantwortet; neu 40 (Zuordnung des Namens "biotec Sued")
  und 41 (Anschriften der beiden Aussenstellen fuer die Stammdaten)
- Multi-Company-Hinweise von zwei auf drei Standorte gezogen
- Rohnotizen: Klaerung vermerkt, Originaltext unveraendert

Co-Authored-By: Claude Opus 5 <noreply@anthropic.com>
Claude-Session: https://claude.ai/code/session_01GFfZvJBCzXCmDgx3EnU1YB
</commit_message>
<xml_diff>
--- a/02_Meetings/2026-08-17_discovery-call.docx
+++ b/02_Meetings/2026-08-17_discovery-call.docx
@@ -1526,7 +1526,7 @@
         <w:ind w:left="397"/>
       </w:pPr>
       <w:r>
-        <w:t>– biotec besteht aus zwei Standorten – Gütersloh als Hauptstandort und München („biotec Süd“). Gesucht wird ein ERP für eine kleine Gesellschaft.</w:t>
+        <w:t>– biotec besteht aus drei Standorten – Gütersloh als Hauptstandort, München (Hygienekontrollen) und dem Technologiepark Mittweida (Analytik Boden und Wasser). Gesucht wird ein ERP für eine kleine Gesellschaft.</w:t>
       </w:r>
     </w:p>
     <w:p>
@@ -2063,7 +2063,7 @@
               <w:rPr>
                 <w:sz w:val="19"/>
               </w:rPr>
-              <w:t>Hauptstandort – ergänzt: zweiter Standort München („biotec Süd“)</w:t>
+              <w:t>Hauptstandort – ergänzt: Standorte München und Technologiepark Mittweida</w:t>
             </w:r>
           </w:p>
         </w:tc>
@@ -2113,7 +2113,7 @@
               <w:rPr>
                 <w:sz w:val="19"/>
               </w:rPr>
-              <w:t>Zwei Standorte: Gütersloh und München. Gesellschaftsrechtliche Struktur zu klären</w:t>
+              <w:t>Drei Standorte: Gütersloh, München, Technologiepark Mittweida. Gesellschaftsrechtliche Struktur zu klären</w:t>
             </w:r>
           </w:p>
         </w:tc>
@@ -2283,7 +2283,7 @@
               <w:rPr>
                 <w:sz w:val="19"/>
               </w:rPr>
-              <w:t>München („biotec Süd“)</w:t>
+              <w:t>München</w:t>
             </w:r>
           </w:p>
         </w:tc>
@@ -2299,7 +2299,7 @@
               <w:rPr>
                 <w:sz w:val="19"/>
               </w:rPr>
-              <w:t>3 Personen</w:t>
+              <w:t>2–3 Personen</w:t>
             </w:r>
           </w:p>
         </w:tc>
@@ -2333,7 +2333,7 @@
               <w:rPr>
                 <w:sz w:val="19"/>
               </w:rPr>
-              <w:t>Walda Technologiepark (Zuordnung offen)</w:t>
+              <w:t>Technologiepark Mittweida</w:t>
             </w:r>
           </w:p>
         </w:tc>
@@ -4456,7 +4456,7 @@
         <w:ind w:left="397"/>
       </w:pPr>
       <w:r>
-        <w:t>– Bekannte Teams: München 3 Personen (Hygienekontrollen), Analytik Boden/Wasser 2–3 Personen, Dozenten 5 (3 intern, 2 extern), Gütersloh mit Labor und Verwaltung.</w:t>
+        <w:t>– Bekannte Teams: München 2–3 Personen (Hygienekontrollen), Mittweida 2–3 Personen (Analytik Boden/Wasser), Dozenten 5 (3 intern, 2 extern), Gütersloh mit Labor und Verwaltung.</w:t>
       </w:r>
     </w:p>
     <w:p>
@@ -5525,7 +5525,7 @@
               <w:rPr>
                 <w:sz w:val="19"/>
               </w:rPr>
-              <w:t>„Walda Technologiepark“: eigener Standort oder Teil von München?</w:t>
+              <w:t>biotec Süd: welchem der drei Standorte entspricht der Name?</w:t>
             </w:r>
           </w:p>
         </w:tc>
@@ -5623,7 +5623,7 @@
               <w:rPr>
                 <w:sz w:val="19"/>
               </w:rPr>
-              <w:t>biotec Süd: eigene Gesellschaft oder nur Standort? Konsolidierungsbedarf?</w:t>
+              <w:t>Sind die drei Standorte eigene Gesellschaften oder Betriebsstätten? Konsolidierungsbedarf?</w:t>
             </w:r>
           </w:p>
         </w:tc>

</xml_diff>